<commit_message>
docs: explainer docx rebuilt with italics rendered
Co-Authored-By: Claude Fable 5.1 <noreply@anthropic.com>
</commit_message>
<xml_diff>
--- a/docs/POLICY_GRAPH_AND_ROUTING.docx
+++ b/docs/POLICY_GRAPH_AND_ROUTING.docx
@@ -78,13 +78,22 @@
       </w:r>
       <w:r>
         <w:rPr>
-          <w:rFonts w:ascii="Consolas" w:hAnsi="Consolas" w:eastAsia="Consolas"/>
+          <w:rFonts w:ascii="Consolas" w:hAnsi="Consolas"/>
           <w:sz w:val="19"/>
         </w:rPr>
         <w:t>edges.json</w:t>
       </w:r>
       <w:r>
-        <w:t>, in the RUSH layout, and the graph compiles back to the stored prompt byte for byte. The graph is therefore not a picture of the policy; it *is* the policy, with a version history, per-guideline evidence, and a record of which guideline drove which decision.</w:t>
+        <w:t xml:space="preserve">, in the RUSH layout, and the graph compiles back to the stored prompt byte for byte. The graph is therefore not a picture of the policy; it </w:t>
+      </w:r>
+      <w:r>
+        <w:rPr>
+          <w:i/>
+        </w:rPr>
+        <w:t>is</w:t>
+      </w:r>
+      <w:r>
+        <w:t xml:space="preserve"> the policy, with a version history, per-guideline evidence, and a record of which guideline drove which decision.</w:t>
       </w:r>
     </w:p>
     <w:p>
@@ -212,7 +221,7 @@
       </w:r>
       <w:r>
         <w:rPr>
-          <w:rFonts w:ascii="Consolas" w:hAnsi="Consolas" w:eastAsia="Consolas"/>
+          <w:rFonts w:ascii="Consolas" w:hAnsi="Consolas"/>
           <w:sz w:val="19"/>
         </w:rPr>
         <w:t>DA.directives.strategy.priced_kill</w:t>
@@ -222,7 +231,7 @@
       </w:r>
       <w:r>
         <w:rPr>
-          <w:rFonts w:ascii="Consolas" w:hAnsi="Consolas" w:eastAsia="Consolas"/>
+          <w:rFonts w:ascii="Consolas" w:hAnsi="Consolas"/>
           <w:sz w:val="19"/>
         </w:rPr>
         <w:t>DA.soul.risk_management</w:t>
@@ -232,7 +241,7 @@
       </w:r>
       <w:r>
         <w:rPr>
-          <w:rFonts w:ascii="Consolas" w:hAnsi="Consolas" w:eastAsia="Consolas"/>
+          <w:rFonts w:ascii="Consolas" w:hAnsi="Consolas"/>
           <w:sz w:val="19"/>
         </w:rPr>
         <w:t>DA.memory.lessons.event_risk</w:t>
@@ -242,7 +251,7 @@
       </w:r>
       <w:r>
         <w:rPr>
-          <w:rFonts w:ascii="Consolas" w:hAnsi="Consolas" w:eastAsia="Consolas"/>
+          <w:rFonts w:ascii="Consolas" w:hAnsi="Consolas"/>
           <w:sz w:val="19"/>
         </w:rPr>
         <w:t>DA.memory.log.2026_09_02_regime</w:t>
@@ -252,7 +261,7 @@
       </w:r>
       <w:r>
         <w:rPr>
-          <w:rFonts w:ascii="Consolas" w:hAnsi="Consolas" w:eastAsia="Consolas"/>
+          <w:rFonts w:ascii="Consolas" w:hAnsi="Consolas"/>
           <w:sz w:val="19"/>
         </w:rPr>
         <w:t>DA.code.index_regime</w:t>
@@ -262,7 +271,7 @@
       </w:r>
       <w:r>
         <w:rPr>
-          <w:rFonts w:ascii="Consolas" w:hAnsi="Consolas" w:eastAsia="Consolas"/>
+          <w:rFonts w:ascii="Consolas" w:hAnsi="Consolas"/>
           <w:sz w:val="19"/>
         </w:rPr>
         <w:t>DA.ltm.20</w:t>
@@ -272,7 +281,7 @@
       </w:r>
       <w:r>
         <w:rPr>
-          <w:rFonts w:ascii="Consolas" w:hAnsi="Consolas" w:eastAsia="Consolas"/>
+          <w:rFonts w:ascii="Consolas" w:hAnsi="Consolas"/>
           <w:sz w:val="19"/>
         </w:rPr>
         <w:t>.md</w:t>
@@ -293,7 +302,7 @@
       </w:r>
       <w:r>
         <w:rPr>
-          <w:rFonts w:ascii="Consolas" w:hAnsi="Consolas" w:eastAsia="Consolas"/>
+          <w:rFonts w:ascii="Consolas" w:hAnsi="Consolas"/>
           <w:sz w:val="19"/>
         </w:rPr>
         <w:t>sep_before + body + sep_after</w:t>
@@ -303,7 +312,7 @@
       </w:r>
       <w:r>
         <w:rPr>
-          <w:rFonts w:ascii="Consolas" w:hAnsi="Consolas" w:eastAsia="Consolas"/>
+          <w:rFonts w:ascii="Consolas" w:hAnsi="Consolas"/>
           <w:sz w:val="19"/>
         </w:rPr>
         <w:t>manifest.compile_order</w:t>
@@ -313,7 +322,7 @@
       </w:r>
       <w:r>
         <w:rPr>
-          <w:rFonts w:ascii="Consolas" w:hAnsi="Consolas" w:eastAsia="Consolas"/>
+          <w:rFonts w:ascii="Consolas" w:hAnsi="Consolas"/>
           <w:sz w:val="19"/>
         </w:rPr>
         <w:t>compile(decompose(row)) == row</w:t>
@@ -355,7 +364,6 @@
             <w:r>
               <w:rPr>
                 <w:b/>
-                <w:sz w:val="18"/>
               </w:rPr>
             </w:r>
             <w:r>
@@ -379,7 +387,6 @@
             <w:r>
               <w:rPr>
                 <w:b/>
-                <w:sz w:val="18"/>
               </w:rPr>
             </w:r>
             <w:r>
@@ -403,7 +410,6 @@
             <w:r>
               <w:rPr>
                 <w:b/>
-                <w:sz w:val="18"/>
               </w:rPr>
             </w:r>
             <w:r>
@@ -427,7 +433,6 @@
             <w:r>
               <w:rPr>
                 <w:b/>
-                <w:sz w:val="18"/>
               </w:rPr>
             </w:r>
             <w:r>
@@ -449,11 +454,7 @@
             <w:pPr>
               <w:spacing w:after="0"/>
             </w:pPr>
-            <w:r>
-              <w:rPr>
-                <w:sz w:val="18"/>
-              </w:rPr>
-            </w:r>
+            <w:r/>
             <w:r>
               <w:rPr>
                 <w:b/>
@@ -471,11 +472,7 @@
             <w:pPr>
               <w:spacing w:after="0"/>
             </w:pPr>
-            <w:r>
-              <w:rPr>
-                <w:sz w:val="18"/>
-              </w:rPr>
-            </w:r>
+            <w:r/>
             <w:r>
               <w:rPr>
                 <w:sz w:val="18"/>
@@ -484,8 +481,8 @@
             </w:r>
             <w:r>
               <w:rPr>
-                <w:rFonts w:ascii="Consolas" w:hAnsi="Consolas" w:eastAsia="Consolas"/>
-                <w:sz w:val="18"/>
+                <w:rFonts w:ascii="Consolas" w:hAnsi="Consolas"/>
+                <w:sz w:val="19"/>
               </w:rPr>
               <w:t>.md</w:t>
             </w:r>
@@ -518,11 +515,7 @@
             <w:pPr>
               <w:spacing w:after="0"/>
             </w:pPr>
-            <w:r>
-              <w:rPr>
-                <w:sz w:val="18"/>
-              </w:rPr>
-            </w:r>
+            <w:r/>
             <w:r>
               <w:rPr>
                 <w:sz w:val="18"/>
@@ -539,11 +532,7 @@
             <w:pPr>
               <w:spacing w:after="0"/>
             </w:pPr>
-            <w:r>
-              <w:rPr>
-                <w:sz w:val="18"/>
-              </w:rPr>
-            </w:r>
+            <w:r/>
             <w:r>
               <w:rPr>
                 <w:sz w:val="18"/>
@@ -562,11 +551,7 @@
             <w:pPr>
               <w:spacing w:after="0"/>
             </w:pPr>
-            <w:r>
-              <w:rPr>
-                <w:sz w:val="18"/>
-              </w:rPr>
-            </w:r>
+            <w:r/>
             <w:r>
               <w:rPr>
                 <w:b/>
@@ -584,11 +569,7 @@
             <w:pPr>
               <w:spacing w:after="0"/>
             </w:pPr>
-            <w:r>
-              <w:rPr>
-                <w:sz w:val="18"/>
-              </w:rPr>
-            </w:r>
+            <w:r/>
             <w:r>
               <w:rPr>
                 <w:sz w:val="18"/>
@@ -605,11 +586,7 @@
             <w:pPr>
               <w:spacing w:after="0"/>
             </w:pPr>
-            <w:r>
-              <w:rPr>
-                <w:sz w:val="18"/>
-              </w:rPr>
-            </w:r>
+            <w:r/>
             <w:r>
               <w:rPr>
                 <w:sz w:val="18"/>
@@ -626,11 +603,7 @@
             <w:pPr>
               <w:spacing w:after="0"/>
             </w:pPr>
-            <w:r>
-              <w:rPr>
-                <w:sz w:val="18"/>
-              </w:rPr>
-            </w:r>
+            <w:r/>
             <w:r>
               <w:rPr>
                 <w:sz w:val="18"/>
@@ -649,11 +622,7 @@
             <w:pPr>
               <w:spacing w:after="0"/>
             </w:pPr>
-            <w:r>
-              <w:rPr>
-                <w:sz w:val="18"/>
-              </w:rPr>
-            </w:r>
+            <w:r/>
             <w:r>
               <w:rPr>
                 <w:b/>
@@ -671,11 +640,7 @@
             <w:pPr>
               <w:spacing w:after="0"/>
             </w:pPr>
-            <w:r>
-              <w:rPr>
-                <w:sz w:val="18"/>
-              </w:rPr>
-            </w:r>
+            <w:r/>
             <w:r>
               <w:rPr>
                 <w:sz w:val="18"/>
@@ -692,11 +657,7 @@
             <w:pPr>
               <w:spacing w:after="0"/>
             </w:pPr>
-            <w:r>
-              <w:rPr>
-                <w:sz w:val="18"/>
-              </w:rPr>
-            </w:r>
+            <w:r/>
             <w:r>
               <w:rPr>
                 <w:sz w:val="18"/>
@@ -713,11 +674,7 @@
             <w:pPr>
               <w:spacing w:after="0"/>
             </w:pPr>
-            <w:r>
-              <w:rPr>
-                <w:sz w:val="18"/>
-              </w:rPr>
-            </w:r>
+            <w:r/>
             <w:r>
               <w:rPr>
                 <w:sz w:val="18"/>
@@ -766,7 +723,6 @@
             <w:r>
               <w:rPr>
                 <w:b/>
-                <w:sz w:val="18"/>
               </w:rPr>
             </w:r>
             <w:r>
@@ -790,7 +746,6 @@
             <w:r>
               <w:rPr>
                 <w:b/>
-                <w:sz w:val="18"/>
               </w:rPr>
             </w:r>
             <w:r>
@@ -814,7 +769,6 @@
             <w:r>
               <w:rPr>
                 <w:b/>
-                <w:sz w:val="18"/>
               </w:rPr>
             </w:r>
             <w:r>
@@ -836,11 +790,7 @@
             <w:pPr>
               <w:spacing w:after="0"/>
             </w:pPr>
-            <w:r>
-              <w:rPr>
-                <w:sz w:val="18"/>
-              </w:rPr>
-            </w:r>
+            <w:r/>
             <w:r>
               <w:rPr>
                 <w:sz w:val="18"/>
@@ -857,15 +807,11 @@
             <w:pPr>
               <w:spacing w:after="0"/>
             </w:pPr>
+            <w:r/>
             <w:r>
               <w:rPr>
-                <w:sz w:val="18"/>
-              </w:rPr>
-            </w:r>
-            <w:r>
-              <w:rPr>
-                <w:rFonts w:ascii="Consolas" w:hAnsi="Consolas" w:eastAsia="Consolas"/>
-                <w:sz w:val="18"/>
+                <w:rFonts w:ascii="Consolas" w:hAnsi="Consolas"/>
+                <w:sz w:val="19"/>
               </w:rPr>
               <w:t>subtype_of</w:t>
             </w:r>
@@ -879,11 +825,7 @@
             <w:pPr>
               <w:spacing w:after="0"/>
             </w:pPr>
-            <w:r>
-              <w:rPr>
-                <w:sz w:val="18"/>
-              </w:rPr>
-            </w:r>
+            <w:r/>
             <w:r>
               <w:rPr>
                 <w:sz w:val="18"/>
@@ -902,11 +844,7 @@
             <w:pPr>
               <w:spacing w:after="0"/>
             </w:pPr>
-            <w:r>
-              <w:rPr>
-                <w:sz w:val="18"/>
-              </w:rPr>
-            </w:r>
+            <w:r/>
             <w:r>
               <w:rPr>
                 <w:sz w:val="18"/>
@@ -923,15 +861,11 @@
             <w:pPr>
               <w:spacing w:after="0"/>
             </w:pPr>
+            <w:r/>
             <w:r>
               <w:rPr>
-                <w:sz w:val="18"/>
-              </w:rPr>
-            </w:r>
-            <w:r>
-              <w:rPr>
-                <w:rFonts w:ascii="Consolas" w:hAnsi="Consolas" w:eastAsia="Consolas"/>
-                <w:sz w:val="18"/>
+                <w:rFonts w:ascii="Consolas" w:hAnsi="Consolas"/>
+                <w:sz w:val="19"/>
               </w:rPr>
               <w:t>includes</w:t>
             </w:r>
@@ -943,8 +877,8 @@
             </w:r>
             <w:r>
               <w:rPr>
-                <w:rFonts w:ascii="Consolas" w:hAnsi="Consolas" w:eastAsia="Consolas"/>
-                <w:sz w:val="18"/>
+                <w:rFonts w:ascii="Consolas" w:hAnsi="Consolas"/>
+                <w:sz w:val="19"/>
               </w:rPr>
               <w:t>constrains</w:t>
             </w:r>
@@ -956,8 +890,8 @@
             </w:r>
             <w:r>
               <w:rPr>
-                <w:rFonts w:ascii="Consolas" w:hAnsi="Consolas" w:eastAsia="Consolas"/>
-                <w:sz w:val="18"/>
+                <w:rFonts w:ascii="Consolas" w:hAnsi="Consolas"/>
+                <w:sz w:val="19"/>
               </w:rPr>
               <w:t>enforced_by</w:t>
             </w:r>
@@ -969,8 +903,8 @@
             </w:r>
             <w:r>
               <w:rPr>
-                <w:rFonts w:ascii="Consolas" w:hAnsi="Consolas" w:eastAsia="Consolas"/>
-                <w:sz w:val="18"/>
+                <w:rFonts w:ascii="Consolas" w:hAnsi="Consolas"/>
+                <w:sz w:val="19"/>
               </w:rPr>
               <w:t>triggers</w:t>
             </w:r>
@@ -984,11 +918,7 @@
             <w:pPr>
               <w:spacing w:after="0"/>
             </w:pPr>
-            <w:r>
-              <w:rPr>
-                <w:sz w:val="18"/>
-              </w:rPr>
-            </w:r>
+            <w:r/>
             <w:r>
               <w:rPr>
                 <w:sz w:val="18"/>
@@ -1007,11 +937,7 @@
             <w:pPr>
               <w:spacing w:after="0"/>
             </w:pPr>
-            <w:r>
-              <w:rPr>
-                <w:sz w:val="18"/>
-              </w:rPr>
-            </w:r>
+            <w:r/>
             <w:r>
               <w:rPr>
                 <w:sz w:val="18"/>
@@ -1028,15 +954,11 @@
             <w:pPr>
               <w:spacing w:after="0"/>
             </w:pPr>
+            <w:r/>
             <w:r>
               <w:rPr>
-                <w:sz w:val="18"/>
-              </w:rPr>
-            </w:r>
-            <w:r>
-              <w:rPr>
-                <w:rFonts w:ascii="Consolas" w:hAnsi="Consolas" w:eastAsia="Consolas"/>
-                <w:sz w:val="18"/>
+                <w:rFonts w:ascii="Consolas" w:hAnsi="Consolas"/>
+                <w:sz w:val="19"/>
               </w:rPr>
               <w:t>related_to</w:t>
             </w:r>
@@ -1048,8 +970,8 @@
             </w:r>
             <w:r>
               <w:rPr>
-                <w:rFonts w:ascii="Consolas" w:hAnsi="Consolas" w:eastAsia="Consolas"/>
-                <w:sz w:val="18"/>
+                <w:rFonts w:ascii="Consolas" w:hAnsi="Consolas"/>
+                <w:sz w:val="19"/>
               </w:rPr>
               <w:t>overlaps</w:t>
             </w:r>
@@ -1061,8 +983,8 @@
             </w:r>
             <w:r>
               <w:rPr>
-                <w:rFonts w:ascii="Consolas" w:hAnsi="Consolas" w:eastAsia="Consolas"/>
-                <w:sz w:val="18"/>
+                <w:rFonts w:ascii="Consolas" w:hAnsi="Consolas"/>
+                <w:sz w:val="19"/>
               </w:rPr>
               <w:t>cites</w:t>
             </w:r>
@@ -1082,11 +1004,7 @@
             <w:pPr>
               <w:spacing w:after="0"/>
             </w:pPr>
-            <w:r>
-              <w:rPr>
-                <w:sz w:val="18"/>
-              </w:rPr>
-            </w:r>
+            <w:r/>
             <w:r>
               <w:rPr>
                 <w:sz w:val="18"/>
@@ -1095,8 +1013,8 @@
             </w:r>
             <w:r>
               <w:rPr>
-                <w:rFonts w:ascii="Consolas" w:hAnsi="Consolas" w:eastAsia="Consolas"/>
-                <w:sz w:val="18"/>
+                <w:rFonts w:ascii="Consolas" w:hAnsi="Consolas"/>
+                <w:sz w:val="19"/>
               </w:rPr>
               <w:t>#tags</w:t>
             </w:r>
@@ -1117,7 +1035,7 @@
       </w:r>
       <w:r>
         <w:rPr>
-          <w:rFonts w:ascii="Consolas" w:hAnsi="Consolas" w:eastAsia="Consolas"/>
+          <w:rFonts w:ascii="Consolas" w:hAnsi="Consolas"/>
           <w:sz w:val="19"/>
         </w:rPr>
         <w:t>CONSTRAINS</w:t>
@@ -1127,7 +1045,7 @@
       </w:r>
       <w:r>
         <w:rPr>
-          <w:rFonts w:ascii="Consolas" w:hAnsi="Consolas" w:eastAsia="Consolas"/>
+          <w:rFonts w:ascii="Consolas" w:hAnsi="Consolas"/>
           <w:sz w:val="19"/>
         </w:rPr>
         <w:t>FACTOR_RULES</w:t>
@@ -1159,7 +1077,7 @@
       </w:r>
       <w:r>
         <w:rPr>
-          <w:rFonts w:ascii="Consolas" w:hAnsi="Consolas" w:eastAsia="Consolas"/>
+          <w:rFonts w:ascii="Consolas" w:hAnsi="Consolas"/>
           <w:sz w:val="19"/>
         </w:rPr>
         <w:t>Latest Feedback Reminder</w:t>
@@ -1183,7 +1101,7 @@
       </w:r>
       <w:r>
         <w:rPr>
-          <w:rFonts w:ascii="Consolas" w:hAnsi="Consolas" w:eastAsia="Consolas"/>
+          <w:rFonts w:ascii="Consolas" w:hAnsi="Consolas"/>
           <w:sz w:val="19"/>
         </w:rPr>
         <w:t>edit</w:t>
@@ -1193,7 +1111,7 @@
       </w:r>
       <w:r>
         <w:rPr>
-          <w:rFonts w:ascii="Consolas" w:hAnsi="Consolas" w:eastAsia="Consolas"/>
+          <w:rFonts w:ascii="Consolas" w:hAnsi="Consolas"/>
           <w:sz w:val="19"/>
         </w:rPr>
         <w:t>add</w:t>
@@ -1203,7 +1121,7 @@
       </w:r>
       <w:r>
         <w:rPr>
-          <w:rFonts w:ascii="Consolas" w:hAnsi="Consolas" w:eastAsia="Consolas"/>
+          <w:rFonts w:ascii="Consolas" w:hAnsi="Consolas"/>
           <w:sz w:val="19"/>
         </w:rPr>
         <w:t>remove</w:t>
@@ -1213,7 +1131,7 @@
       </w:r>
       <w:r>
         <w:rPr>
-          <w:rFonts w:ascii="Consolas" w:hAnsi="Consolas" w:eastAsia="Consolas"/>
+          <w:rFonts w:ascii="Consolas" w:hAnsi="Consolas"/>
           <w:sz w:val="19"/>
         </w:rPr>
         <w:t>primary</w:t>
@@ -1223,7 +1141,7 @@
       </w:r>
       <w:r>
         <w:rPr>
-          <w:rFonts w:ascii="Consolas" w:hAnsi="Consolas" w:eastAsia="Consolas"/>
+          <w:rFonts w:ascii="Consolas" w:hAnsi="Consolas"/>
           <w:sz w:val="19"/>
         </w:rPr>
         <w:t>prompt_versions</w:t>
@@ -1233,7 +1151,7 @@
       </w:r>
       <w:r>
         <w:rPr>
-          <w:rFonts w:ascii="Consolas" w:hAnsi="Consolas" w:eastAsia="Consolas"/>
+          <w:rFonts w:ascii="Consolas" w:hAnsi="Consolas"/>
           <w:sz w:val="19"/>
         </w:rPr>
         <w:t>policy_graph_proposals</w:t>
@@ -1257,7 +1175,7 @@
       </w:r>
       <w:r>
         <w:rPr>
-          <w:rFonts w:ascii="Consolas" w:hAnsi="Consolas" w:eastAsia="Consolas"/>
+          <w:rFonts w:ascii="Consolas" w:hAnsi="Consolas"/>
           <w:sz w:val="19"/>
         </w:rPr>
         <w:t>policy_graph/operator.py: apply_hand_authored</w:t>
@@ -1267,7 +1185,7 @@
       </w:r>
       <w:r>
         <w:rPr>
-          <w:rFonts w:ascii="Consolas" w:hAnsi="Consolas" w:eastAsia="Consolas"/>
+          <w:rFonts w:ascii="Consolas" w:hAnsi="Consolas"/>
           <w:sz w:val="19"/>
         </w:rPr>
         <w:t>maintenance_version</w:t>
@@ -1287,7 +1205,16 @@
         <w:t>Plain gates.</w:t>
       </w:r>
       <w:r>
-        <w:t xml:space="preserve"> Every writer of rules is held to one shape: *"N. LABEL — IF one condition on a supplied field, with its number THEN one action. Otherwise next gate. Falsified if which number over how many trades proves it wrong."*, at most 240 characters, one condition per gate. A style lint flags long, multi-condition, parenthetical or unfalsified gates; the critic and the human both see the warnings.</w:t>
+        <w:t xml:space="preserve"> Every writer of rules is held to one shape: </w:t>
+      </w:r>
+      <w:r>
+        <w:rPr>
+          <w:i/>
+        </w:rPr>
+        <w:t>"N. LABEL — IF one condition on a supplied field, with its number THEN one action. Otherwise next gate. Falsified if which number over how many trades proves it wrong."</w:t>
+      </w:r>
+      <w:r>
+        <w:t>, at most 240 characters, one condition per gate. A style lint flags long, multi-condition, parenthetical or unfalsified gates; the critic and the human both see the warnings.</w:t>
       </w:r>
     </w:p>
     <w:p>
@@ -1305,7 +1232,7 @@
       </w:r>
       <w:r>
         <w:rPr>
-          <w:rFonts w:ascii="Consolas" w:hAnsi="Consolas" w:eastAsia="Consolas"/>
+          <w:rFonts w:ascii="Consolas" w:hAnsi="Consolas"/>
           <w:sz w:val="19"/>
         </w:rPr>
         <w:t>cited</w:t>
@@ -1315,7 +1242,7 @@
       </w:r>
       <w:r>
         <w:rPr>
-          <w:rFonts w:ascii="Consolas" w:hAnsi="Consolas" w:eastAsia="Consolas"/>
+          <w:rFonts w:ascii="Consolas" w:hAnsi="Consolas"/>
           <w:sz w:val="19"/>
         </w:rPr>
         <w:t xml:space="preserve"> [cites: DA.…]</w:t>
@@ -1369,7 +1296,6 @@
             <w:r>
               <w:rPr>
                 <w:b/>
-                <w:sz w:val="18"/>
               </w:rPr>
             </w:r>
             <w:r>
@@ -1393,7 +1319,6 @@
             <w:r>
               <w:rPr>
                 <w:b/>
-                <w:sz w:val="18"/>
               </w:rPr>
             </w:r>
             <w:r>
@@ -1415,11 +1340,7 @@
             <w:pPr>
               <w:spacing w:after="0"/>
             </w:pPr>
-            <w:r>
-              <w:rPr>
-                <w:sz w:val="18"/>
-              </w:rPr>
-            </w:r>
+            <w:r/>
             <w:r>
               <w:rPr>
                 <w:sz w:val="18"/>
@@ -1436,11 +1357,7 @@
             <w:pPr>
               <w:spacing w:after="0"/>
             </w:pPr>
-            <w:r>
-              <w:rPr>
-                <w:sz w:val="18"/>
-              </w:rPr>
-            </w:r>
+            <w:r/>
             <w:r>
               <w:rPr>
                 <w:sz w:val="18"/>
@@ -1459,11 +1376,7 @@
             <w:pPr>
               <w:spacing w:after="0"/>
             </w:pPr>
-            <w:r>
-              <w:rPr>
-                <w:sz w:val="18"/>
-              </w:rPr>
-            </w:r>
+            <w:r/>
             <w:r>
               <w:rPr>
                 <w:sz w:val="18"/>
@@ -1480,11 +1393,7 @@
             <w:pPr>
               <w:spacing w:after="0"/>
             </w:pPr>
-            <w:r>
-              <w:rPr>
-                <w:sz w:val="18"/>
-              </w:rPr>
-            </w:r>
+            <w:r/>
             <w:r>
               <w:rPr>
                 <w:sz w:val="18"/>
@@ -1503,11 +1412,7 @@
             <w:pPr>
               <w:spacing w:after="0"/>
             </w:pPr>
-            <w:r>
-              <w:rPr>
-                <w:sz w:val="18"/>
-              </w:rPr>
-            </w:r>
+            <w:r/>
             <w:r>
               <w:rPr>
                 <w:sz w:val="18"/>
@@ -1524,11 +1429,7 @@
             <w:pPr>
               <w:spacing w:after="0"/>
             </w:pPr>
-            <w:r>
-              <w:rPr>
-                <w:sz w:val="18"/>
-              </w:rPr>
-            </w:r>
+            <w:r/>
             <w:r>
               <w:rPr>
                 <w:sz w:val="18"/>
@@ -1537,8 +1438,8 @@
             </w:r>
             <w:r>
               <w:rPr>
-                <w:rFonts w:ascii="Consolas" w:hAnsi="Consolas" w:eastAsia="Consolas"/>
-                <w:sz w:val="18"/>
+                <w:rFonts w:ascii="Consolas" w:hAnsi="Consolas"/>
+                <w:sz w:val="19"/>
               </w:rPr>
               <w:t>Latest Feedback Reminder</w:t>
             </w:r>
@@ -1554,11 +1455,7 @@
             <w:pPr>
               <w:spacing w:after="0"/>
             </w:pPr>
-            <w:r>
-              <w:rPr>
-                <w:sz w:val="18"/>
-              </w:rPr>
-            </w:r>
+            <w:r/>
             <w:r>
               <w:rPr>
                 <w:sz w:val="18"/>
@@ -1575,11 +1472,7 @@
             <w:pPr>
               <w:spacing w:after="0"/>
             </w:pPr>
-            <w:r>
-              <w:rPr>
-                <w:sz w:val="18"/>
-              </w:rPr>
-            </w:r>
+            <w:r/>
             <w:r>
               <w:rPr>
                 <w:sz w:val="18"/>
@@ -1598,11 +1491,7 @@
             <w:pPr>
               <w:spacing w:after="0"/>
             </w:pPr>
-            <w:r>
-              <w:rPr>
-                <w:sz w:val="18"/>
-              </w:rPr>
-            </w:r>
+            <w:r/>
             <w:r>
               <w:rPr>
                 <w:sz w:val="18"/>
@@ -1619,11 +1508,7 @@
             <w:pPr>
               <w:spacing w:after="0"/>
             </w:pPr>
-            <w:r>
-              <w:rPr>
-                <w:sz w:val="18"/>
-              </w:rPr>
-            </w:r>
+            <w:r/>
             <w:r>
               <w:rPr>
                 <w:sz w:val="18"/>
@@ -1642,11 +1527,7 @@
             <w:pPr>
               <w:spacing w:after="0"/>
             </w:pPr>
-            <w:r>
-              <w:rPr>
-                <w:sz w:val="18"/>
-              </w:rPr>
-            </w:r>
+            <w:r/>
             <w:r>
               <w:rPr>
                 <w:sz w:val="18"/>
@@ -1663,11 +1544,7 @@
             <w:pPr>
               <w:spacing w:after="0"/>
             </w:pPr>
-            <w:r>
-              <w:rPr>
-                <w:sz w:val="18"/>
-              </w:rPr>
-            </w:r>
+            <w:r/>
             <w:r>
               <w:rPr>
                 <w:sz w:val="18"/>
@@ -1686,11 +1563,7 @@
             <w:pPr>
               <w:spacing w:after="0"/>
             </w:pPr>
-            <w:r>
-              <w:rPr>
-                <w:sz w:val="18"/>
-              </w:rPr>
-            </w:r>
+            <w:r/>
             <w:r>
               <w:rPr>
                 <w:sz w:val="18"/>
@@ -1707,11 +1580,7 @@
             <w:pPr>
               <w:spacing w:after="0"/>
             </w:pPr>
-            <w:r>
-              <w:rPr>
-                <w:sz w:val="18"/>
-              </w:rPr>
-            </w:r>
+            <w:r/>
             <w:r>
               <w:rPr>
                 <w:sz w:val="18"/>
@@ -1730,11 +1599,7 @@
             <w:pPr>
               <w:spacing w:after="0"/>
             </w:pPr>
-            <w:r>
-              <w:rPr>
-                <w:sz w:val="18"/>
-              </w:rPr>
-            </w:r>
+            <w:r/>
             <w:r>
               <w:rPr>
                 <w:sz w:val="18"/>
@@ -1751,11 +1616,7 @@
             <w:pPr>
               <w:spacing w:after="0"/>
             </w:pPr>
-            <w:r>
-              <w:rPr>
-                <w:sz w:val="18"/>
-              </w:rPr>
-            </w:r>
+            <w:r/>
             <w:r>
               <w:rPr>
                 <w:sz w:val="18"/>
@@ -1764,8 +1625,8 @@
             </w:r>
             <w:r>
               <w:rPr>
-                <w:rFonts w:ascii="Consolas" w:hAnsi="Consolas" w:eastAsia="Consolas"/>
-                <w:sz w:val="18"/>
+                <w:rFonts w:ascii="Consolas" w:hAnsi="Consolas"/>
+                <w:sz w:val="19"/>
               </w:rPr>
               <w:t>#tags</w:t>
             </w:r>
@@ -1787,11 +1648,7 @@
             <w:pPr>
               <w:spacing w:after="0"/>
             </w:pPr>
-            <w:r>
-              <w:rPr>
-                <w:sz w:val="18"/>
-              </w:rPr>
-            </w:r>
+            <w:r/>
             <w:r>
               <w:rPr>
                 <w:sz w:val="18"/>
@@ -1808,11 +1665,7 @@
             <w:pPr>
               <w:spacing w:after="0"/>
             </w:pPr>
-            <w:r>
-              <w:rPr>
-                <w:sz w:val="18"/>
-              </w:rPr>
-            </w:r>
+            <w:r/>
             <w:r>
               <w:rPr>
                 <w:sz w:val="18"/>
@@ -1830,7 +1683,7 @@
       </w:r>
       <w:r>
         <w:rPr>
-          <w:rFonts w:ascii="Consolas" w:hAnsi="Consolas" w:eastAsia="Consolas"/>
+          <w:rFonts w:ascii="Consolas" w:hAnsi="Consolas"/>
           <w:sz w:val="19"/>
         </w:rPr>
         <w:t xml:space="preserve"> ⟨id · cited 7d/30d/90d: 3/12/20 · win 58% n=12⟩</w:t>
@@ -1840,7 +1693,7 @@
       </w:r>
       <w:r>
         <w:rPr>
-          <w:rFonts w:ascii="Consolas" w:hAnsi="Consolas" w:eastAsia="Consolas"/>
+          <w:rFonts w:ascii="Consolas" w:hAnsi="Consolas"/>
           <w:sz w:val="19"/>
         </w:rPr>
         <w:t>policy_graph_hits</w:t>
@@ -1850,7 +1703,7 @@
       </w:r>
       <w:r>
         <w:rPr>
-          <w:rFonts w:ascii="Consolas" w:hAnsi="Consolas" w:eastAsia="Consolas"/>
+          <w:rFonts w:ascii="Consolas" w:hAnsi="Consolas"/>
           <w:sz w:val="19"/>
         </w:rPr>
         <w:t>policy_graph_runs</w:t>
@@ -1891,7 +1744,16 @@
     </w:p>
     <w:p>
       <w:r>
-        <w:t>A decision's path is *context → route that served a guideline → guideline cited → action → outcome*. The tab draws it as a three-column flow (routes or world factors → guidelines → buy / hold / sell), lists guidelines cited but never served (the query missed them) and served but never cited (dead weight), and scores each guideline over the closed trades that cited it: win rate, P&amp;L, and what was co-cited on its winners and its losers.</w:t>
+        <w:t xml:space="preserve">A decision's path is </w:t>
+      </w:r>
+      <w:r>
+        <w:rPr>
+          <w:i/>
+        </w:rPr>
+        <w:t>context → route that served a guideline → guideline cited → action → outcome</w:t>
+      </w:r>
+      <w:r>
+        <w:t>. The tab draws it as a three-column flow (routes or world factors → guidelines → buy / hold / sell), lists guidelines cited but never served (the query missed them) and served but never cited (dead weight), and scores each guideline over the closed trades that cited it: win rate, P&amp;L, and what was co-cited on its winners and its losers.</w:t>
       </w:r>
     </w:p>
     <w:p>
@@ -1928,7 +1790,7 @@
       </w:r>
       <w:r>
         <w:rPr>
-          <w:rFonts w:ascii="Consolas" w:hAnsi="Consolas" w:eastAsia="Consolas"/>
+          <w:rFonts w:ascii="Consolas" w:hAnsi="Consolas"/>
           <w:sz w:val="19"/>
         </w:rPr>
         <w:t>&lt;id&gt;.md</w:t>
@@ -1938,7 +1800,7 @@
       </w:r>
       <w:r>
         <w:rPr>
-          <w:rFonts w:ascii="Consolas" w:hAnsi="Consolas" w:eastAsia="Consolas"/>
+          <w:rFonts w:ascii="Consolas" w:hAnsi="Consolas"/>
           <w:sz w:val="19"/>
         </w:rPr>
         <w:t>edges.json</w:t>
@@ -1948,7 +1810,7 @@
       </w:r>
       <w:r>
         <w:rPr>
-          <w:rFonts w:ascii="Consolas" w:hAnsi="Consolas" w:eastAsia="Consolas"/>
+          <w:rFonts w:ascii="Consolas" w:hAnsi="Consolas"/>
           <w:sz w:val="19"/>
         </w:rPr>
         <w:t>manifest.json</w:t>
@@ -1958,7 +1820,7 @@
       </w:r>
       <w:r>
         <w:rPr>
-          <w:rFonts w:ascii="Consolas" w:hAnsi="Consolas" w:eastAsia="Consolas"/>
+          <w:rFonts w:ascii="Consolas" w:hAnsi="Consolas"/>
           <w:sz w:val="19"/>
         </w:rPr>
         <w:t>latest/</w:t>
@@ -1968,7 +1830,7 @@
       </w:r>
       <w:r>
         <w:rPr>
-          <w:rFonts w:ascii="Consolas" w:hAnsi="Consolas" w:eastAsia="Consolas"/>
+          <w:rFonts w:ascii="Consolas" w:hAnsi="Consolas"/>
           <w:sz w:val="19"/>
         </w:rPr>
         <w:t>baseline/v0</w:t>
@@ -2064,7 +1926,7 @@
       </w:r>
       <w:r>
         <w:rPr>
-          <w:rFonts w:ascii="Consolas" w:hAnsi="Consolas" w:eastAsia="Consolas"/>
+          <w:rFonts w:ascii="Consolas" w:hAnsi="Consolas"/>
           <w:sz w:val="19"/>
         </w:rPr>
         <w:t>policy_graph/</w:t>
@@ -2074,7 +1936,7 @@
       </w:r>
       <w:r>
         <w:rPr>
-          <w:rFonts w:ascii="Consolas" w:hAnsi="Consolas" w:eastAsia="Consolas"/>
+          <w:rFonts w:ascii="Consolas" w:hAnsi="Consolas"/>
           <w:sz w:val="19"/>
         </w:rPr>
         <w:t>decompose.py</w:t>
@@ -2084,7 +1946,7 @@
       </w:r>
       <w:r>
         <w:rPr>
-          <w:rFonts w:ascii="Consolas" w:hAnsi="Consolas" w:eastAsia="Consolas"/>
+          <w:rFonts w:ascii="Consolas" w:hAnsi="Consolas"/>
           <w:sz w:val="19"/>
         </w:rPr>
         <w:t>compile.py</w:t>
@@ -2094,7 +1956,7 @@
       </w:r>
       <w:r>
         <w:rPr>
-          <w:rFonts w:ascii="Consolas" w:hAnsi="Consolas" w:eastAsia="Consolas"/>
+          <w:rFonts w:ascii="Consolas" w:hAnsi="Consolas"/>
           <w:sz w:val="19"/>
         </w:rPr>
         <w:t>store.py</w:t>
@@ -2104,7 +1966,7 @@
       </w:r>
       <w:r>
         <w:rPr>
-          <w:rFonts w:ascii="Consolas" w:hAnsi="Consolas" w:eastAsia="Consolas"/>
+          <w:rFonts w:ascii="Consolas" w:hAnsi="Consolas"/>
           <w:sz w:val="19"/>
         </w:rPr>
         <w:t>service.py</w:t>
@@ -2114,7 +1976,7 @@
       </w:r>
       <w:r>
         <w:rPr>
-          <w:rFonts w:ascii="Consolas" w:hAnsi="Consolas" w:eastAsia="Consolas"/>
+          <w:rFonts w:ascii="Consolas" w:hAnsi="Consolas"/>
           <w:sz w:val="19"/>
         </w:rPr>
         <w:t>assembly.py</w:t>
@@ -2124,7 +1986,7 @@
       </w:r>
       <w:r>
         <w:rPr>
-          <w:rFonts w:ascii="Consolas" w:hAnsi="Consolas" w:eastAsia="Consolas"/>
+          <w:rFonts w:ascii="Consolas" w:hAnsi="Consolas"/>
           <w:sz w:val="19"/>
         </w:rPr>
         <w:t>citations.py</w:t>
@@ -2134,7 +1996,7 @@
       </w:r>
       <w:r>
         <w:rPr>
-          <w:rFonts w:ascii="Consolas" w:hAnsi="Consolas" w:eastAsia="Consolas"/>
+          <w:rFonts w:ascii="Consolas" w:hAnsi="Consolas"/>
           <w:sz w:val="19"/>
         </w:rPr>
         <w:t>proposals.py</w:t>
@@ -2144,7 +2006,7 @@
       </w:r>
       <w:r>
         <w:rPr>
-          <w:rFonts w:ascii="Consolas" w:hAnsi="Consolas" w:eastAsia="Consolas"/>
+          <w:rFonts w:ascii="Consolas" w:hAnsi="Consolas"/>
           <w:sz w:val="19"/>
         </w:rPr>
         <w:t>operator.py</w:t>
@@ -2154,7 +2016,7 @@
       </w:r>
       <w:r>
         <w:rPr>
-          <w:rFonts w:ascii="Consolas" w:hAnsi="Consolas" w:eastAsia="Consolas"/>
+          <w:rFonts w:ascii="Consolas" w:hAnsi="Consolas"/>
           <w:sz w:val="19"/>
         </w:rPr>
         <w:t>paths.py</w:t>
@@ -2164,7 +2026,7 @@
       </w:r>
       <w:r>
         <w:rPr>
-          <w:rFonts w:ascii="Consolas" w:hAnsi="Consolas" w:eastAsia="Consolas"/>
+          <w:rFonts w:ascii="Consolas" w:hAnsi="Consolas"/>
           <w:sz w:val="19"/>
         </w:rPr>
         <w:t>factors.py</w:t>
@@ -2174,7 +2036,7 @@
       </w:r>
       <w:r>
         <w:rPr>
-          <w:rFonts w:ascii="Consolas" w:hAnsi="Consolas" w:eastAsia="Consolas"/>
+          <w:rFonts w:ascii="Consolas" w:hAnsi="Consolas"/>
           <w:sz w:val="19"/>
         </w:rPr>
         <w:t>prompts.py</w:t>
@@ -2184,7 +2046,7 @@
       </w:r>
       <w:r>
         <w:rPr>
-          <w:rFonts w:ascii="Consolas" w:hAnsi="Consolas" w:eastAsia="Consolas"/>
+          <w:rFonts w:ascii="Consolas" w:hAnsi="Consolas"/>
           <w:sz w:val="19"/>
         </w:rPr>
         <w:t>code_blocks.py</w:t>
@@ -2202,7 +2064,7 @@
       </w:r>
       <w:r>
         <w:rPr>
-          <w:rFonts w:ascii="Consolas" w:hAnsi="Consolas" w:eastAsia="Consolas"/>
+          <w:rFonts w:ascii="Consolas" w:hAnsi="Consolas"/>
           <w:sz w:val="19"/>
         </w:rPr>
         <w:t>/policy-graph</w:t>
@@ -2212,7 +2074,7 @@
       </w:r>
       <w:r>
         <w:rPr>
-          <w:rFonts w:ascii="Consolas" w:hAnsi="Consolas" w:eastAsia="Consolas"/>
+          <w:rFonts w:ascii="Consolas" w:hAnsi="Consolas"/>
           <w:sz w:val="19"/>
         </w:rPr>
         <w:t>/api/policy-graph/{agents, versions, graph, node, diff, compiled, bundle, file, paths, proposals}</w:t>
@@ -2230,7 +2092,7 @@
       </w:r>
       <w:r>
         <w:rPr>
-          <w:rFonts w:ascii="Consolas" w:hAnsi="Consolas" w:eastAsia="Consolas"/>
+          <w:rFonts w:ascii="Consolas" w:hAnsi="Consolas"/>
           <w:sz w:val="19"/>
         </w:rPr>
         <w:t>python -m policy_graph.backfill --config-hash &lt;hash&gt; [--verify-only]</w:t>
@@ -2240,7 +2102,7 @@
       </w:r>
       <w:r>
         <w:rPr>
-          <w:rFonts w:ascii="Consolas" w:hAnsi="Consolas" w:eastAsia="Consolas"/>
+          <w:rFonts w:ascii="Consolas" w:hAnsi="Consolas"/>
           <w:sz w:val="19"/>
         </w:rPr>
         <w:t>--baseline</w:t>
@@ -2258,7 +2120,7 @@
       </w:r>
       <w:r>
         <w:rPr>
-          <w:rFonts w:ascii="Consolas" w:hAnsi="Consolas" w:eastAsia="Consolas"/>
+          <w:rFonts w:ascii="Consolas" w:hAnsi="Consolas"/>
           <w:sz w:val="19"/>
         </w:rPr>
         <w:t>docs/POLICY_GRAPH.md</w:t>

</xml_diff>